<commit_message>
Finalize thesis manuscript, results assets, and Word workflows
</commit_message>
<xml_diff>
--- a/tables/styled_preview/results_tables_preview.docx
+++ b/tables/styled_preview/results_tables_preview.docx
@@ -29,13 +29,14 @@
           <w:sz w:val="24"/>
           <w:szCs w:val="24"/>
         </w:rPr>
-        <w:t xml:space="preserve">Toto je nový natívny DOCX preview build so štýlovým presetom `pevš-final-preview`. Tabuľky sú užšie než textový blok, používajú Times New Roman, len horizontálne čiary a zjednotený caption/note systém.</w:t>
+        <w:t xml:space="preserve">Toto je nový natívny DOCX preview build so štýlovým presetom `pevš-final-preview`. Tabuľky sú užšie než textový blok, používajú Times New Roman, len horizontálne čiary a caption systém podľa lokálneho sprievodcu.</w:t>
       </w:r>
     </w:p>
     <w:p>
       <w:pPr>
         <w:jc w:val="left"/>
-        <w:spacing w:after="80" w:line="240" w:lineRule="auto"/>
+        <w:ind w:left="1013" w:right="1013"/>
+        <w:spacing w:after="70" w:line="276" w:lineRule="auto"/>
       </w:pPr>
       <w:r>
         <w:rPr>
@@ -45,8 +46,15 @@
           <w:sz w:val="20"/>
           <w:szCs w:val="20"/>
         </w:rPr>
-        <w:t xml:space="preserve">Tabuľka 1. </w:t>
+        <w:t xml:space="preserve">Tabuľka 1</w:t>
       </w:r>
+    </w:p>
+    <w:p>
+      <w:pPr>
+        <w:jc w:val="left"/>
+        <w:ind w:left="1013" w:right="1013"/>
+        <w:spacing w:after="80" w:line="276" w:lineRule="auto"/>
+      </w:pPr>
       <w:r>
         <w:rPr>
           <w:rFonts w:ascii="Times New Roman" w:hAnsi="Times New Roman" w:cs="Times New Roman"/>
@@ -55,7 +63,7 @@
           <w:sz w:val="20"/>
           <w:szCs w:val="20"/>
         </w:rPr>
-        <w:t xml:space="preserve">Základná charakteristika datasetu.</w:t>
+        <w:t xml:space="preserve">Základná charakteristika datasetu</w:t>
       </w:r>
     </w:p>
     <w:tbl>
@@ -186,7 +194,7 @@
                 <w:sz w:val="20"/>
                 <w:szCs w:val="20"/>
               </w:rPr>
-              <w:t xml:space="preserve">Clean dáta</w:t>
+              <w:t xml:space="preserve">Vyčistené dáta</w:t>
             </w:r>
           </w:p>
         </w:tc>
@@ -238,7 +246,7 @@
                 <w:sz w:val="20"/>
                 <w:szCs w:val="20"/>
               </w:rPr>
-              <w:t xml:space="preserve">1</w:t>
+              <w:t xml:space="preserve">6</w:t>
             </w:r>
           </w:p>
         </w:tc>
@@ -265,7 +273,7 @@
                 <w:sz w:val="20"/>
                 <w:szCs w:val="20"/>
               </w:rPr>
-              <w:t xml:space="preserve">Počet transkriptov</w:t>
+              <w:t xml:space="preserve">Počet prepisov rozhovorov</w:t>
             </w:r>
           </w:p>
         </w:tc>
@@ -290,7 +298,7 @@
                 <w:sz w:val="20"/>
                 <w:szCs w:val="20"/>
               </w:rPr>
-              <w:t xml:space="preserve">4</w:t>
+              <w:t xml:space="preserve">72</w:t>
             </w:r>
           </w:p>
         </w:tc>
@@ -342,7 +350,7 @@
                 <w:sz w:val="20"/>
                 <w:szCs w:val="20"/>
               </w:rPr>
-              <w:t xml:space="preserve">4</w:t>
+              <w:t xml:space="preserve">12</w:t>
             </w:r>
           </w:p>
         </w:tc>
@@ -394,7 +402,7 @@
                 <w:sz w:val="20"/>
                 <w:szCs w:val="20"/>
               </w:rPr>
-              <w:t xml:space="preserve">4</w:t>
+              <w:t xml:space="preserve">199</w:t>
             </w:r>
           </w:p>
         </w:tc>
@@ -421,7 +429,7 @@
                 <w:sz w:val="20"/>
                 <w:szCs w:val="20"/>
               </w:rPr>
-              <w:t xml:space="preserve">Priemerný počet hodnotení na transkript</w:t>
+              <w:t xml:space="preserve">Priemerný počet hodnotení na prepis rozhovoru</w:t>
             </w:r>
           </w:p>
         </w:tc>
@@ -446,7 +454,7 @@
                 <w:sz w:val="20"/>
                 <w:szCs w:val="20"/>
               </w:rPr>
-              <w:t xml:space="preserve">1</w:t>
+              <w:t xml:space="preserve">2.764</w:t>
             </w:r>
           </w:p>
         </w:tc>
@@ -473,7 +481,7 @@
                 <w:sz w:val="20"/>
                 <w:szCs w:val="20"/>
               </w:rPr>
-              <w:t xml:space="preserve">Minimálny počet hodnotení na transkript</w:t>
+              <w:t xml:space="preserve">Minimálny počet hodnotení na prepis rozhovoru</w:t>
             </w:r>
           </w:p>
         </w:tc>
@@ -498,7 +506,7 @@
                 <w:sz w:val="20"/>
                 <w:szCs w:val="20"/>
               </w:rPr>
-              <w:t xml:space="preserve">1</w:t>
+              <w:t xml:space="preserve">2</w:t>
             </w:r>
           </w:p>
         </w:tc>
@@ -525,7 +533,7 @@
                 <w:sz w:val="20"/>
                 <w:szCs w:val="20"/>
               </w:rPr>
-              <w:t xml:space="preserve">Maximálny počet hodnotení na transkript</w:t>
+              <w:t xml:space="preserve">Maximálny počet hodnotení na prepis rozhovoru</w:t>
             </w:r>
           </w:p>
         </w:tc>
@@ -550,7 +558,7 @@
                 <w:sz w:val="20"/>
                 <w:szCs w:val="20"/>
               </w:rPr>
-              <w:t xml:space="preserve">1</w:t>
+              <w:t xml:space="preserve">6</w:t>
             </w:r>
           </w:p>
         </w:tc>
@@ -577,7 +585,7 @@
                 <w:sz w:val="20"/>
                 <w:szCs w:val="20"/>
               </w:rPr>
-              <w:t xml:space="preserve">Režim výpočtu chyby závažnosti</w:t>
+              <w:t xml:space="preserve">Spôsob výpočtu chyby závažnosti</w:t>
             </w:r>
           </w:p>
         </w:tc>
@@ -602,7 +610,7 @@
                 <w:sz w:val="20"/>
                 <w:szCs w:val="20"/>
               </w:rPr>
-              <w:t xml:space="preserve">direct_1to5</w:t>
+              <w:t xml:space="preserve">Priama absolútna chyba na škále 1-5</w:t>
             </w:r>
           </w:p>
         </w:tc>
@@ -629,7 +637,7 @@
                 <w:sz w:val="20"/>
                 <w:szCs w:val="20"/>
               </w:rPr>
-              <w:t xml:space="preserve">Počet hodnotení bez guardrailu</w:t>
+              <w:t xml:space="preserve">Počet hodnotení v G0</w:t>
             </w:r>
           </w:p>
         </w:tc>
@@ -654,7 +662,7 @@
                 <w:sz w:val="20"/>
                 <w:szCs w:val="20"/>
               </w:rPr>
-              <w:t xml:space="preserve">4</w:t>
+              <w:t xml:space="preserve">118</w:t>
             </w:r>
           </w:p>
         </w:tc>
@@ -681,7 +689,7 @@
                 <w:sz w:val="20"/>
                 <w:szCs w:val="20"/>
               </w:rPr>
-              <w:t xml:space="preserve">Počet hodnotení pre profil P1</w:t>
+              <w:t xml:space="preserve">Počet hodnotení v G1</w:t>
             </w:r>
           </w:p>
         </w:tc>
@@ -706,7 +714,7 @@
                 <w:sz w:val="20"/>
                 <w:szCs w:val="20"/>
               </w:rPr>
-              <w:t xml:space="preserve">4</w:t>
+              <w:t xml:space="preserve">81</w:t>
             </w:r>
           </w:p>
         </w:tc>
@@ -733,7 +741,7 @@
                 <w:sz w:val="20"/>
                 <w:szCs w:val="20"/>
               </w:rPr>
-              <w:t xml:space="preserve">Bez guardrailu × profil P1</w:t>
+              <w:t xml:space="preserve">Počet hodnotení pre P1</w:t>
             </w:r>
           </w:p>
         </w:tc>
@@ -758,7 +766,7 @@
                 <w:sz w:val="20"/>
                 <w:szCs w:val="20"/>
               </w:rPr>
-              <w:t xml:space="preserve">4</w:t>
+              <w:t xml:space="preserve">78</w:t>
             </w:r>
           </w:p>
         </w:tc>
@@ -781,7 +789,8 @@
     <w:p>
       <w:pPr>
         <w:jc w:val="left"/>
-        <w:spacing w:after="80" w:line="240" w:lineRule="auto"/>
+        <w:ind w:left="213" w:right="213"/>
+        <w:spacing w:after="70" w:line="276" w:lineRule="auto"/>
       </w:pPr>
       <w:r>
         <w:rPr>
@@ -791,8 +800,15 @@
           <w:sz w:val="20"/>
           <w:szCs w:val="20"/>
         </w:rPr>
-        <w:t xml:space="preserve">Tabuľka 4. </w:t>
+        <w:t xml:space="preserve">Tabuľka 2</w:t>
       </w:r>
+    </w:p>
+    <w:p>
+      <w:pPr>
+        <w:jc w:val="left"/>
+        <w:ind w:left="213" w:right="213"/>
+        <w:spacing w:after="80" w:line="276" w:lineRule="auto"/>
+      </w:pPr>
       <w:r>
         <w:rPr>
           <w:rFonts w:ascii="Times New Roman" w:hAnsi="Times New Roman" w:cs="Times New Roman"/>
@@ -801,7 +817,7 @@
           <w:sz w:val="20"/>
           <w:szCs w:val="20"/>
         </w:rPr>
-        <w:t xml:space="preserve">Vnútorná konzistencia ratingových blokov.</w:t>
+        <w:t xml:space="preserve">Vnútorná konzistencia ratingových blokov</w:t>
       </w:r>
     </w:p>
     <w:tbl>
@@ -1097,7 +1113,7 @@
                 <w:sz w:val="20"/>
                 <w:szCs w:val="20"/>
               </w:rPr>
-              <w:t xml:space="preserve">4</w:t>
+              <w:t xml:space="preserve">199</w:t>
             </w:r>
           </w:p>
         </w:tc>
@@ -1122,7 +1138,7 @@
                 <w:sz w:val="20"/>
                 <w:szCs w:val="20"/>
               </w:rPr>
-              <w:t xml:space="preserve">-0.933</w:t>
+              <w:t xml:space="preserve">0.843</w:t>
             </w:r>
           </w:p>
         </w:tc>
@@ -1147,57 +1163,57 @@
                 <w:sz w:val="20"/>
                 <w:szCs w:val="20"/>
               </w:rPr>
+              <w:t xml:space="preserve">0.854</w:t>
+            </w:r>
+          </w:p>
+        </w:tc>
+        <w:tc>
+          <w:tcPr>
+            <w:tcW w:w="900" w:type="dxa"/>
+            <w:tcBorders>
+              <w:top w:val="nil"/>
+              <w:left w:val="nil"/>
+              <w:bottom w:val="nil"/>
+              <w:right w:val="nil"/>
+            </w:tcBorders>
+          </w:tcPr>
+          <w:p>
+            <w:pPr>
+              <w:jc w:val="left"/>
+              <w:spacing w:after="0" w:line="240" w:lineRule="auto"/>
+            </w:pPr>
+            <w:r>
+              <w:rPr>
+                <w:rFonts w:ascii="Times New Roman" w:hAnsi="Times New Roman" w:cs="Times New Roman"/>
+                <w:sz w:val="20"/>
+                <w:szCs w:val="20"/>
+              </w:rPr>
+              <w:t xml:space="preserve">OK</w:t>
+            </w:r>
+          </w:p>
+        </w:tc>
+        <w:tc>
+          <w:tcPr>
+            <w:tcW w:w="2200" w:type="dxa"/>
+            <w:tcBorders>
+              <w:top w:val="nil"/>
+              <w:left w:val="nil"/>
+              <w:bottom w:val="nil"/>
+              <w:right w:val="nil"/>
+            </w:tcBorders>
+          </w:tcPr>
+          <w:p>
+            <w:pPr>
+              <w:jc w:val="left"/>
+              <w:spacing w:after="0" w:line="240" w:lineRule="auto"/>
+            </w:pPr>
+            <w:r>
+              <w:rPr>
+                <w:rFonts w:ascii="Times New Roman" w:hAnsi="Times New Roman" w:cs="Times New Roman"/>
+                <w:sz w:val="20"/>
+                <w:szCs w:val="20"/>
+              </w:rPr>
               <w:t xml:space="preserve"/>
-            </w:r>
-          </w:p>
-        </w:tc>
-        <w:tc>
-          <w:tcPr>
-            <w:tcW w:w="900" w:type="dxa"/>
-            <w:tcBorders>
-              <w:top w:val="nil"/>
-              <w:left w:val="nil"/>
-              <w:bottom w:val="nil"/>
-              <w:right w:val="nil"/>
-            </w:tcBorders>
-          </w:tcPr>
-          <w:p>
-            <w:pPr>
-              <w:jc w:val="left"/>
-              <w:spacing w:after="0" w:line="240" w:lineRule="auto"/>
-            </w:pPr>
-            <w:r>
-              <w:rPr>
-                <w:rFonts w:ascii="Times New Roman" w:hAnsi="Times New Roman" w:cs="Times New Roman"/>
-                <w:sz w:val="20"/>
-                <w:szCs w:val="20"/>
-              </w:rPr>
-              <w:t xml:space="preserve">OK</w:t>
-            </w:r>
-          </w:p>
-        </w:tc>
-        <w:tc>
-          <w:tcPr>
-            <w:tcW w:w="2200" w:type="dxa"/>
-            <w:tcBorders>
-              <w:top w:val="nil"/>
-              <w:left w:val="nil"/>
-              <w:bottom w:val="nil"/>
-              <w:right w:val="nil"/>
-            </w:tcBorders>
-          </w:tcPr>
-          <w:p>
-            <w:pPr>
-              <w:jc w:val="left"/>
-              <w:spacing w:after="0" w:line="240" w:lineRule="auto"/>
-            </w:pPr>
-            <w:r>
-              <w:rPr>
-                <w:rFonts w:ascii="Times New Roman" w:hAnsi="Times New Roman" w:cs="Times New Roman"/>
-                <w:sz w:val="20"/>
-                <w:szCs w:val="20"/>
-              </w:rPr>
-              <w:t xml:space="preserve">Cronbachovo α bolo odhadnuté; McDonaldovo ω sa nepodarilo vypočítať.</w:t>
             </w:r>
           </w:p>
         </w:tc>
@@ -1224,7 +1240,7 @@
                 <w:sz w:val="20"/>
                 <w:szCs w:val="20"/>
               </w:rPr>
-              <w:t xml:space="preserve">Jadro klinickej vierohodnosti</w:t>
+              <w:t xml:space="preserve">Jadro indexu klinickej vierohodnosti</w:t>
             </w:r>
           </w:p>
         </w:tc>
@@ -1274,7 +1290,7 @@
                 <w:sz w:val="20"/>
                 <w:szCs w:val="20"/>
               </w:rPr>
-              <w:t xml:space="preserve">4</w:t>
+              <w:t xml:space="preserve">199</w:t>
             </w:r>
           </w:p>
         </w:tc>
@@ -1299,7 +1315,7 @@
                 <w:sz w:val="20"/>
                 <w:szCs w:val="20"/>
               </w:rPr>
-              <w:t xml:space="preserve">-8</w:t>
+              <w:t xml:space="preserve">0.772</w:t>
             </w:r>
           </w:p>
         </w:tc>
@@ -1324,57 +1340,57 @@
                 <w:sz w:val="20"/>
                 <w:szCs w:val="20"/>
               </w:rPr>
+              <w:t xml:space="preserve">0.779</w:t>
+            </w:r>
+          </w:p>
+        </w:tc>
+        <w:tc>
+          <w:tcPr>
+            <w:tcW w:w="900" w:type="dxa"/>
+            <w:tcBorders>
+              <w:top w:val="nil"/>
+              <w:left w:val="nil"/>
+              <w:bottom w:val="nil"/>
+              <w:right w:val="nil"/>
+            </w:tcBorders>
+          </w:tcPr>
+          <w:p>
+            <w:pPr>
+              <w:jc w:val="left"/>
+              <w:spacing w:after="0" w:line="240" w:lineRule="auto"/>
+            </w:pPr>
+            <w:r>
+              <w:rPr>
+                <w:rFonts w:ascii="Times New Roman" w:hAnsi="Times New Roman" w:cs="Times New Roman"/>
+                <w:sz w:val="20"/>
+                <w:szCs w:val="20"/>
+              </w:rPr>
+              <w:t xml:space="preserve">OK</w:t>
+            </w:r>
+          </w:p>
+        </w:tc>
+        <w:tc>
+          <w:tcPr>
+            <w:tcW w:w="2200" w:type="dxa"/>
+            <w:tcBorders>
+              <w:top w:val="nil"/>
+              <w:left w:val="nil"/>
+              <w:bottom w:val="nil"/>
+              <w:right w:val="nil"/>
+            </w:tcBorders>
+          </w:tcPr>
+          <w:p>
+            <w:pPr>
+              <w:jc w:val="left"/>
+              <w:spacing w:after="0" w:line="240" w:lineRule="auto"/>
+            </w:pPr>
+            <w:r>
+              <w:rPr>
+                <w:rFonts w:ascii="Times New Roman" w:hAnsi="Times New Roman" w:cs="Times New Roman"/>
+                <w:sz w:val="20"/>
+                <w:szCs w:val="20"/>
+              </w:rPr>
               <w:t xml:space="preserve"/>
-            </w:r>
-          </w:p>
-        </w:tc>
-        <w:tc>
-          <w:tcPr>
-            <w:tcW w:w="900" w:type="dxa"/>
-            <w:tcBorders>
-              <w:top w:val="nil"/>
-              <w:left w:val="nil"/>
-              <w:bottom w:val="nil"/>
-              <w:right w:val="nil"/>
-            </w:tcBorders>
-          </w:tcPr>
-          <w:p>
-            <w:pPr>
-              <w:jc w:val="left"/>
-              <w:spacing w:after="0" w:line="240" w:lineRule="auto"/>
-            </w:pPr>
-            <w:r>
-              <w:rPr>
-                <w:rFonts w:ascii="Times New Roman" w:hAnsi="Times New Roman" w:cs="Times New Roman"/>
-                <w:sz w:val="20"/>
-                <w:szCs w:val="20"/>
-              </w:rPr>
-              <w:t xml:space="preserve">OK</w:t>
-            </w:r>
-          </w:p>
-        </w:tc>
-        <w:tc>
-          <w:tcPr>
-            <w:tcW w:w="2200" w:type="dxa"/>
-            <w:tcBorders>
-              <w:top w:val="nil"/>
-              <w:left w:val="nil"/>
-              <w:bottom w:val="nil"/>
-              <w:right w:val="nil"/>
-            </w:tcBorders>
-          </w:tcPr>
-          <w:p>
-            <w:pPr>
-              <w:jc w:val="left"/>
-              <w:spacing w:after="0" w:line="240" w:lineRule="auto"/>
-            </w:pPr>
-            <w:r>
-              <w:rPr>
-                <w:rFonts w:ascii="Times New Roman" w:hAnsi="Times New Roman" w:cs="Times New Roman"/>
-                <w:sz w:val="20"/>
-                <w:szCs w:val="20"/>
-              </w:rPr>
-              <w:t xml:space="preserve">Cronbachovo α bolo odhadnuté; McDonaldovo ω sa nepodarilo vypočítať.</w:t>
             </w:r>
           </w:p>
         </w:tc>
@@ -1451,7 +1467,7 @@
                 <w:sz w:val="20"/>
                 <w:szCs w:val="20"/>
               </w:rPr>
-              <w:t xml:space="preserve">4</w:t>
+              <w:t xml:space="preserve">199</w:t>
             </w:r>
           </w:p>
         </w:tc>
@@ -1476,7 +1492,7 @@
                 <w:sz w:val="20"/>
                 <w:szCs w:val="20"/>
               </w:rPr>
-              <w:t xml:space="preserve">-Inf</w:t>
+              <w:t xml:space="preserve">0.741</w:t>
             </w:r>
           </w:p>
         </w:tc>
@@ -1501,57 +1517,57 @@
                 <w:sz w:val="20"/>
                 <w:szCs w:val="20"/>
               </w:rPr>
+              <w:t xml:space="preserve">0.76</w:t>
+            </w:r>
+          </w:p>
+        </w:tc>
+        <w:tc>
+          <w:tcPr>
+            <w:tcW w:w="900" w:type="dxa"/>
+            <w:tcBorders>
+              <w:top w:val="nil"/>
+              <w:left w:val="nil"/>
+              <w:bottom w:val="single" w:sz="10" w:space="0" w:color="000000"/>
+              <w:right w:val="nil"/>
+            </w:tcBorders>
+          </w:tcPr>
+          <w:p>
+            <w:pPr>
+              <w:jc w:val="left"/>
+              <w:spacing w:after="0" w:line="240" w:lineRule="auto"/>
+            </w:pPr>
+            <w:r>
+              <w:rPr>
+                <w:rFonts w:ascii="Times New Roman" w:hAnsi="Times New Roman" w:cs="Times New Roman"/>
+                <w:sz w:val="20"/>
+                <w:szCs w:val="20"/>
+              </w:rPr>
+              <w:t xml:space="preserve">OK</w:t>
+            </w:r>
+          </w:p>
+        </w:tc>
+        <w:tc>
+          <w:tcPr>
+            <w:tcW w:w="2200" w:type="dxa"/>
+            <w:tcBorders>
+              <w:top w:val="nil"/>
+              <w:left w:val="nil"/>
+              <w:bottom w:val="single" w:sz="10" w:space="0" w:color="000000"/>
+              <w:right w:val="nil"/>
+            </w:tcBorders>
+          </w:tcPr>
+          <w:p>
+            <w:pPr>
+              <w:jc w:val="left"/>
+              <w:spacing w:after="0" w:line="240" w:lineRule="auto"/>
+            </w:pPr>
+            <w:r>
+              <w:rPr>
+                <w:rFonts w:ascii="Times New Roman" w:hAnsi="Times New Roman" w:cs="Times New Roman"/>
+                <w:sz w:val="20"/>
+                <w:szCs w:val="20"/>
+              </w:rPr>
               <w:t xml:space="preserve"/>
-            </w:r>
-          </w:p>
-        </w:tc>
-        <w:tc>
-          <w:tcPr>
-            <w:tcW w:w="900" w:type="dxa"/>
-            <w:tcBorders>
-              <w:top w:val="nil"/>
-              <w:left w:val="nil"/>
-              <w:bottom w:val="single" w:sz="10" w:space="0" w:color="000000"/>
-              <w:right w:val="nil"/>
-            </w:tcBorders>
-          </w:tcPr>
-          <w:p>
-            <w:pPr>
-              <w:jc w:val="left"/>
-              <w:spacing w:after="0" w:line="240" w:lineRule="auto"/>
-            </w:pPr>
-            <w:r>
-              <w:rPr>
-                <w:rFonts w:ascii="Times New Roman" w:hAnsi="Times New Roman" w:cs="Times New Roman"/>
-                <w:sz w:val="20"/>
-                <w:szCs w:val="20"/>
-              </w:rPr>
-              <w:t xml:space="preserve">OK</w:t>
-            </w:r>
-          </w:p>
-        </w:tc>
-        <w:tc>
-          <w:tcPr>
-            <w:tcW w:w="2200" w:type="dxa"/>
-            <w:tcBorders>
-              <w:top w:val="nil"/>
-              <w:left w:val="nil"/>
-              <w:bottom w:val="single" w:sz="10" w:space="0" w:color="000000"/>
-              <w:right w:val="nil"/>
-            </w:tcBorders>
-          </w:tcPr>
-          <w:p>
-            <w:pPr>
-              <w:jc w:val="left"/>
-              <w:spacing w:after="0" w:line="240" w:lineRule="auto"/>
-            </w:pPr>
-            <w:r>
-              <w:rPr>
-                <w:rFonts w:ascii="Times New Roman" w:hAnsi="Times New Roman" w:cs="Times New Roman"/>
-                <w:sz w:val="20"/>
-                <w:szCs w:val="20"/>
-              </w:rPr>
-              <w:t xml:space="preserve">Cronbachovo α bolo odhadnuté; McDonaldovo ω sa nepodarilo vypočítať.</w:t>
             </w:r>
           </w:p>
         </w:tc>
@@ -1584,7 +1600,8 @@
     <w:p>
       <w:pPr>
         <w:jc w:val="left"/>
-        <w:spacing w:after="80" w:line="240" w:lineRule="auto"/>
+        <w:ind w:left="213" w:right="213"/>
+        <w:spacing w:after="70" w:line="276" w:lineRule="auto"/>
       </w:pPr>
       <w:r>
         <w:rPr>
@@ -1594,8 +1611,15 @@
           <w:sz w:val="20"/>
           <w:szCs w:val="20"/>
         </w:rPr>
-        <w:t xml:space="preserve">Tabuľka 5. </w:t>
+        <w:t xml:space="preserve">Tabuľka 3</w:t>
       </w:r>
+    </w:p>
+    <w:p>
+      <w:pPr>
+        <w:jc w:val="left"/>
+        <w:ind w:left="213" w:right="213"/>
+        <w:spacing w:after="80" w:line="276" w:lineRule="auto"/>
+      </w:pPr>
       <w:r>
         <w:rPr>
           <w:rFonts w:ascii="Times New Roman" w:hAnsi="Times New Roman" w:cs="Times New Roman"/>
@@ -1604,7 +1628,7 @@
           <w:sz w:val="20"/>
           <w:szCs w:val="20"/>
         </w:rPr>
-        <w:t xml:space="preserve">Interrater reliabilita hlavných outcome-ov.</w:t>
+        <w:t xml:space="preserve">Interrater reliabilita hlavných outcome-ov</w:t>
       </w:r>
     </w:p>
     <w:tbl>
@@ -1850,7 +1874,7 @@
                 <w:sz w:val="20"/>
                 <w:szCs w:val="20"/>
               </w:rPr>
-              <w:t xml:space="preserve">Kompozit klinickej plausibility</w:t>
+              <w:t xml:space="preserve">Kompozit klinickej vierohodnosti</w:t>
             </w:r>
           </w:p>
         </w:tc>
@@ -1975,7 +1999,7 @@
                 <w:sz w:val="20"/>
                 <w:szCs w:val="20"/>
               </w:rPr>
-              <w:t xml:space="preserve">Preskočené</w:t>
+              <w:t xml:space="preserve">OK</w:t>
             </w:r>
           </w:p>
         </w:tc>
@@ -2000,7 +2024,7 @@
                 <w:sz w:val="20"/>
                 <w:szCs w:val="20"/>
               </w:rPr>
-              <w:t xml:space="preserve">Pre ICC treba aspoň 2 transkripty a 2 hodnotiteľov.</w:t>
+              <w:t xml:space="preserve"/>
             </w:r>
           </w:p>
         </w:tc>
@@ -2027,7 +2051,7 @@
                 <w:sz w:val="20"/>
                 <w:szCs w:val="20"/>
               </w:rPr>
-              <w:t xml:space="preserve">Kompozit defektov / red flags</w:t>
+              <w:t xml:space="preserve">Kompozit defektov</w:t>
             </w:r>
           </w:p>
         </w:tc>
@@ -2152,7 +2176,7 @@
                 <w:sz w:val="20"/>
                 <w:szCs w:val="20"/>
               </w:rPr>
-              <w:t xml:space="preserve">Preskočené</w:t>
+              <w:t xml:space="preserve">OK</w:t>
             </w:r>
           </w:p>
         </w:tc>
@@ -2177,7 +2201,7 @@
                 <w:sz w:val="20"/>
                 <w:szCs w:val="20"/>
               </w:rPr>
-              <w:t xml:space="preserve">Pre ICC treba aspoň 2 transkripty a 2 hodnotiteľov.</w:t>
+              <w:t xml:space="preserve"/>
             </w:r>
           </w:p>
         </w:tc>
@@ -2329,7 +2353,7 @@
                 <w:sz w:val="20"/>
                 <w:szCs w:val="20"/>
               </w:rPr>
-              <w:t xml:space="preserve">Preskočené</w:t>
+              <w:t xml:space="preserve">OK</w:t>
             </w:r>
           </w:p>
         </w:tc>
@@ -2354,7 +2378,7 @@
                 <w:sz w:val="20"/>
                 <w:szCs w:val="20"/>
               </w:rPr>
-              <w:t xml:space="preserve">Pre ICC treba aspoň 2 transkripty a 2 hodnotiteľov.</w:t>
+              <w:t xml:space="preserve"/>
             </w:r>
           </w:p>
         </w:tc>
@@ -2506,7 +2530,7 @@
                 <w:sz w:val="20"/>
                 <w:szCs w:val="20"/>
               </w:rPr>
-              <w:t xml:space="preserve">Preskočené</w:t>
+              <w:t xml:space="preserve">OK</w:t>
             </w:r>
           </w:p>
         </w:tc>
@@ -2531,7 +2555,7 @@
                 <w:sz w:val="20"/>
                 <w:szCs w:val="20"/>
               </w:rPr>
-              <w:t xml:space="preserve">Pre ICC treba aspoň 2 transkripty a 2 hodnotiteľov.</w:t>
+              <w:t xml:space="preserve"/>
             </w:r>
           </w:p>
         </w:tc>
@@ -2564,7 +2588,8 @@
     <w:p>
       <w:pPr>
         <w:jc w:val="left"/>
-        <w:spacing w:after="80" w:line="240" w:lineRule="auto"/>
+        <w:ind w:left="313" w:right="313"/>
+        <w:spacing w:after="70" w:line="276" w:lineRule="auto"/>
       </w:pPr>
       <w:r>
         <w:rPr>
@@ -2574,8 +2599,15 @@
           <w:sz w:val="20"/>
           <w:szCs w:val="20"/>
         </w:rPr>
-        <w:t xml:space="preserve">Tabuľka 6. </w:t>
+        <w:t xml:space="preserve">Tabuľka 4</w:t>
       </w:r>
+    </w:p>
+    <w:p>
+      <w:pPr>
+        <w:jc w:val="left"/>
+        <w:ind w:left="313" w:right="313"/>
+        <w:spacing w:after="80" w:line="276" w:lineRule="auto"/>
+      </w:pPr>
       <w:r>
         <w:rPr>
           <w:rFonts w:ascii="Times New Roman" w:hAnsi="Times New Roman" w:cs="Times New Roman"/>
@@ -2584,7 +2616,7 @@
           <w:sz w:val="20"/>
           <w:szCs w:val="20"/>
         </w:rPr>
-        <w:t xml:space="preserve">Súhrn jadrových zmiešaných modelov.</w:t>
+        <w:t xml:space="preserve">Súhrn jadrových zmiešaných modelov</w:t>
       </w:r>
     </w:p>
     <w:tbl>
@@ -2802,7 +2834,7 @@
                 <w:sz w:val="20"/>
                 <w:szCs w:val="20"/>
               </w:rPr>
-              <w:t xml:space="preserve">Kompozit klinickej plausibility</w:t>
+              <w:t xml:space="preserve">Kompozit klinickej vierohodnosti</w:t>
             </w:r>
           </w:p>
         </w:tc>
@@ -2852,7 +2884,7 @@
                 <w:sz w:val="20"/>
                 <w:szCs w:val="20"/>
               </w:rPr>
-              <w:t xml:space="preserve"/>
+              <w:t xml:space="preserve">3.803</w:t>
             </w:r>
           </w:p>
         </w:tc>
@@ -2877,7 +2909,7 @@
                 <w:sz w:val="20"/>
                 <w:szCs w:val="20"/>
               </w:rPr>
-              <w:t xml:space="preserve"/>
+              <w:t xml:space="preserve">3.399</w:t>
             </w:r>
           </w:p>
         </w:tc>
@@ -2902,7 +2934,7 @@
                 <w:sz w:val="20"/>
                 <w:szCs w:val="20"/>
               </w:rPr>
-              <w:t xml:space="preserve"/>
+              <w:t xml:space="preserve">4.207</w:t>
             </w:r>
           </w:p>
         </w:tc>
@@ -2927,7 +2959,7 @@
                 <w:sz w:val="20"/>
                 <w:szCs w:val="20"/>
               </w:rPr>
-              <w:t xml:space="preserve">Preskočené</w:t>
+              <w:t xml:space="preserve">OK</w:t>
             </w:r>
           </w:p>
         </w:tc>
@@ -2954,7 +2986,7 @@
                 <w:sz w:val="20"/>
                 <w:szCs w:val="20"/>
               </w:rPr>
-              <w:t xml:space="preserve">Kompozit defektov / red flags</w:t>
+              <w:t xml:space="preserve">Kompozit klinickej vierohodnosti</w:t>
             </w:r>
           </w:p>
         </w:tc>
@@ -3004,7 +3036,7 @@
                 <w:sz w:val="20"/>
                 <w:szCs w:val="20"/>
               </w:rPr>
-              <w:t xml:space="preserve"/>
+              <w:t xml:space="preserve">0.028</w:t>
             </w:r>
           </w:p>
         </w:tc>
@@ -3029,7 +3061,7 @@
                 <w:sz w:val="20"/>
                 <w:szCs w:val="20"/>
               </w:rPr>
-              <w:t xml:space="preserve"/>
+              <w:t xml:space="preserve">-0.154</w:t>
             </w:r>
           </w:p>
         </w:tc>
@@ -3054,7 +3086,7 @@
                 <w:sz w:val="20"/>
                 <w:szCs w:val="20"/>
               </w:rPr>
-              <w:t xml:space="preserve"/>
+              <w:t xml:space="preserve">0.211</w:t>
             </w:r>
           </w:p>
         </w:tc>
@@ -3079,7 +3111,7 @@
                 <w:sz w:val="20"/>
                 <w:szCs w:val="20"/>
               </w:rPr>
-              <w:t xml:space="preserve">Preskočené</w:t>
+              <w:t xml:space="preserve">OK</w:t>
             </w:r>
           </w:p>
         </w:tc>
@@ -3106,7 +3138,7 @@
                 <w:sz w:val="20"/>
                 <w:szCs w:val="20"/>
               </w:rPr>
-              <w:t xml:space="preserve">Priemerná absolútna chyba A1-A9 voči seedu</w:t>
+              <w:t xml:space="preserve">Kompozit klinickej vierohodnosti</w:t>
             </w:r>
           </w:p>
         </w:tc>
@@ -3156,7 +3188,7 @@
                 <w:sz w:val="20"/>
                 <w:szCs w:val="20"/>
               </w:rPr>
-              <w:t xml:space="preserve"/>
+              <w:t xml:space="preserve">-0.016</w:t>
             </w:r>
           </w:p>
         </w:tc>
@@ -3181,7 +3213,7 @@
                 <w:sz w:val="20"/>
                 <w:szCs w:val="20"/>
               </w:rPr>
-              <w:t xml:space="preserve"/>
+              <w:t xml:space="preserve">-0.193</w:t>
             </w:r>
           </w:p>
         </w:tc>
@@ -3206,7 +3238,7 @@
                 <w:sz w:val="20"/>
                 <w:szCs w:val="20"/>
               </w:rPr>
-              <w:t xml:space="preserve"/>
+              <w:t xml:space="preserve">0.16</w:t>
             </w:r>
           </w:p>
         </w:tc>
@@ -3231,7 +3263,7 @@
                 <w:sz w:val="20"/>
                 <w:szCs w:val="20"/>
               </w:rPr>
-              <w:t xml:space="preserve">Preskočené</w:t>
+              <w:t xml:space="preserve">OK</w:t>
             </w:r>
           </w:p>
         </w:tc>
@@ -3258,7 +3290,7 @@
                 <w:sz w:val="20"/>
                 <w:szCs w:val="20"/>
               </w:rPr>
-              <w:t xml:space="preserve">Absolútna chyba S1 voči seedu</w:t>
+              <w:t xml:space="preserve">Kompozit klinickej vierohodnosti</w:t>
             </w:r>
           </w:p>
         </w:tc>
@@ -3308,7 +3340,7 @@
                 <w:sz w:val="20"/>
                 <w:szCs w:val="20"/>
               </w:rPr>
-              <w:t xml:space="preserve"/>
+              <w:t xml:space="preserve">-0.007</w:t>
             </w:r>
           </w:p>
         </w:tc>
@@ -3333,7 +3365,7 @@
                 <w:sz w:val="20"/>
                 <w:szCs w:val="20"/>
               </w:rPr>
-              <w:t xml:space="preserve"/>
+              <w:t xml:space="preserve">-0.183</w:t>
             </w:r>
           </w:p>
         </w:tc>
@@ -3358,7 +3390,7 @@
                 <w:sz w:val="20"/>
                 <w:szCs w:val="20"/>
               </w:rPr>
-              <w:t xml:space="preserve"/>
+              <w:t xml:space="preserve">0.17</w:t>
             </w:r>
           </w:p>
         </w:tc>
@@ -3383,7 +3415,7 @@
                 <w:sz w:val="20"/>
                 <w:szCs w:val="20"/>
               </w:rPr>
-              <w:t xml:space="preserve">Preskočené</w:t>
+              <w:t xml:space="preserve">OK</w:t>
             </w:r>
           </w:p>
         </w:tc>
@@ -3410,7 +3442,7 @@
                 <w:sz w:val="20"/>
                 <w:szCs w:val="20"/>
               </w:rPr>
-              <w:t xml:space="preserve">Absolútna chyba S2 voči seedu</w:t>
+              <w:t xml:space="preserve">Kompozit klinickej vierohodnosti</w:t>
             </w:r>
           </w:p>
         </w:tc>
@@ -3460,7 +3492,7 @@
                 <w:sz w:val="20"/>
                 <w:szCs w:val="20"/>
               </w:rPr>
-              <w:t xml:space="preserve"/>
+              <w:t xml:space="preserve">0.024</w:t>
             </w:r>
           </w:p>
         </w:tc>
@@ -3485,7 +3517,7 @@
                 <w:sz w:val="20"/>
                 <w:szCs w:val="20"/>
               </w:rPr>
-              <w:t xml:space="preserve"/>
+              <w:t xml:space="preserve">-0.247</w:t>
             </w:r>
           </w:p>
         </w:tc>
@@ -3510,7 +3542,7 @@
                 <w:sz w:val="20"/>
                 <w:szCs w:val="20"/>
               </w:rPr>
-              <w:t xml:space="preserve"/>
+              <w:t xml:space="preserve">0.296</w:t>
             </w:r>
           </w:p>
         </w:tc>
@@ -3535,7 +3567,7 @@
                 <w:sz w:val="20"/>
                 <w:szCs w:val="20"/>
               </w:rPr>
-              <w:t xml:space="preserve">Preskočené</w:t>
+              <w:t xml:space="preserve">OK</w:t>
             </w:r>
           </w:p>
         </w:tc>
@@ -3562,7 +3594,7 @@
                 <w:sz w:val="20"/>
                 <w:szCs w:val="20"/>
               </w:rPr>
-              <w:t xml:space="preserve">Prirodzenosť jazyka a štýlu odpovedí</w:t>
+              <w:t xml:space="preserve">Kompozit klinickej vierohodnosti</w:t>
             </w:r>
           </w:p>
         </w:tc>
@@ -3587,7 +3619,7 @@
                 <w:sz w:val="20"/>
                 <w:szCs w:val="20"/>
               </w:rPr>
-              <w:t xml:space="preserve">CLMM</w:t>
+              <w:t xml:space="preserve">LMM</w:t>
             </w:r>
           </w:p>
         </w:tc>
@@ -3612,7 +3644,7 @@
                 <w:sz w:val="20"/>
                 <w:szCs w:val="20"/>
               </w:rPr>
-              <w:t xml:space="preserve"/>
+              <w:t xml:space="preserve">0.019</w:t>
             </w:r>
           </w:p>
         </w:tc>
@@ -3637,7 +3669,7 @@
                 <w:sz w:val="20"/>
                 <w:szCs w:val="20"/>
               </w:rPr>
-              <w:t xml:space="preserve"/>
+              <w:t xml:space="preserve">-0.25</w:t>
             </w:r>
           </w:p>
         </w:tc>
@@ -3662,7 +3694,7 @@
                 <w:sz w:val="20"/>
                 <w:szCs w:val="20"/>
               </w:rPr>
-              <w:t xml:space="preserve"/>
+              <w:t xml:space="preserve">0.289</w:t>
             </w:r>
           </w:p>
         </w:tc>
@@ -3687,7 +3719,7 @@
                 <w:sz w:val="20"/>
                 <w:szCs w:val="20"/>
               </w:rPr>
-              <w:t xml:space="preserve">Preskočené</w:t>
+              <w:t xml:space="preserve">OK</w:t>
             </w:r>
           </w:p>
         </w:tc>
@@ -3714,7 +3746,7 @@
                 <w:sz w:val="20"/>
                 <w:szCs w:val="20"/>
               </w:rPr>
-              <w:t xml:space="preserve">Použiteľnosť rozhovoru na tréningové / výučbové účely</w:t>
+              <w:t xml:space="preserve">Kompozit defektov</w:t>
             </w:r>
           </w:p>
         </w:tc>
@@ -3739,7 +3771,7 @@
                 <w:sz w:val="20"/>
                 <w:szCs w:val="20"/>
               </w:rPr>
-              <w:t xml:space="preserve">CLMM</w:t>
+              <w:t xml:space="preserve">LMM</w:t>
             </w:r>
           </w:p>
         </w:tc>
@@ -3764,7 +3796,7 @@
                 <w:sz w:val="20"/>
                 <w:szCs w:val="20"/>
               </w:rPr>
-              <w:t xml:space="preserve"/>
+              <w:t xml:space="preserve">2.155</w:t>
             </w:r>
           </w:p>
         </w:tc>
@@ -3789,7 +3821,7 @@
                 <w:sz w:val="20"/>
                 <w:szCs w:val="20"/>
               </w:rPr>
-              <w:t xml:space="preserve"/>
+              <w:t xml:space="preserve">1.792</w:t>
             </w:r>
           </w:p>
         </w:tc>
@@ -3814,7 +3846,7 @@
                 <w:sz w:val="20"/>
                 <w:szCs w:val="20"/>
               </w:rPr>
-              <w:t xml:space="preserve"/>
+              <w:t xml:space="preserve">2.519</w:t>
             </w:r>
           </w:p>
         </w:tc>
@@ -3839,7 +3871,7 @@
                 <w:sz w:val="20"/>
                 <w:szCs w:val="20"/>
               </w:rPr>
-              <w:t xml:space="preserve">Preskočené</w:t>
+              <w:t xml:space="preserve">OK</w:t>
             </w:r>
           </w:p>
         </w:tc>
@@ -3866,7 +3898,7 @@
                 <w:sz w:val="20"/>
                 <w:szCs w:val="20"/>
               </w:rPr>
-              <w:t xml:space="preserve">Ľudský odhad celkovej závažnosti depresívnej symptomatiky</w:t>
+              <w:t xml:space="preserve">Kompozit defektov</w:t>
             </w:r>
           </w:p>
         </w:tc>
@@ -3891,7 +3923,7 @@
                 <w:sz w:val="20"/>
                 <w:szCs w:val="20"/>
               </w:rPr>
-              <w:t xml:space="preserve">CLMM</w:t>
+              <w:t xml:space="preserve">LMM</w:t>
             </w:r>
           </w:p>
         </w:tc>
@@ -3916,7 +3948,7 @@
                 <w:sz w:val="20"/>
                 <w:szCs w:val="20"/>
               </w:rPr>
-              <w:t xml:space="preserve"/>
+              <w:t xml:space="preserve">-0.131</w:t>
             </w:r>
           </w:p>
         </w:tc>
@@ -3941,7 +3973,7 @@
                 <w:sz w:val="20"/>
                 <w:szCs w:val="20"/>
               </w:rPr>
-              <w:t xml:space="preserve"/>
+              <w:t xml:space="preserve">-0.305</w:t>
             </w:r>
           </w:p>
         </w:tc>
@@ -3966,7 +3998,7 @@
                 <w:sz w:val="20"/>
                 <w:szCs w:val="20"/>
               </w:rPr>
-              <w:t xml:space="preserve"/>
+              <w:t xml:space="preserve">0.043</w:t>
             </w:r>
           </w:p>
         </w:tc>
@@ -3991,7 +4023,7 @@
                 <w:sz w:val="20"/>
                 <w:szCs w:val="20"/>
               </w:rPr>
-              <w:t xml:space="preserve">Preskočené</w:t>
+              <w:t xml:space="preserve">OK</w:t>
             </w:r>
           </w:p>
         </w:tc>
@@ -4024,7 +4056,8 @@
     <w:p>
       <w:pPr>
         <w:jc w:val="left"/>
-        <w:spacing w:after="80" w:line="240" w:lineRule="auto"/>
+        <w:ind w:left="13" w:right="13"/>
+        <w:spacing w:after="70" w:line="276" w:lineRule="auto"/>
       </w:pPr>
       <w:r>
         <w:rPr>
@@ -4034,8 +4067,15 @@
           <w:sz w:val="20"/>
           <w:szCs w:val="20"/>
         </w:rPr>
-        <w:t xml:space="preserve">Tabuľka S4. </w:t>
+        <w:t xml:space="preserve">Tabuľka 5</w:t>
       </w:r>
+    </w:p>
+    <w:p>
+      <w:pPr>
+        <w:jc w:val="left"/>
+        <w:ind w:left="13" w:right="13"/>
+        <w:spacing w:after="80" w:line="276" w:lineRule="auto"/>
+      </w:pPr>
       <w:r>
         <w:rPr>
           <w:rFonts w:ascii="Times New Roman" w:hAnsi="Times New Roman" w:cs="Times New Roman"/>
@@ -4044,7 +4084,7 @@
           <w:sz w:val="20"/>
           <w:szCs w:val="20"/>
         </w:rPr>
-        <w:t xml:space="preserve">Predbežná expertná kontrola položiek ratingového nástroja.</w:t>
+        <w:t xml:space="preserve">Predbežná expertná kontrola položiek ratingového nástroja</w:t>
       </w:r>
     </w:p>
     <w:tbl>
@@ -6748,7 +6788,7 @@
     <w:p>
       <w:pPr>
         <w:jc w:val="left"/>
-        <w:spacing w:after="80" w:line="240" w:lineRule="auto"/>
+        <w:spacing w:after="70" w:line="276" w:lineRule="auto"/>
       </w:pPr>
       <w:r>
         <w:rPr>
@@ -6758,8 +6798,14 @@
           <w:sz w:val="20"/>
           <w:szCs w:val="20"/>
         </w:rPr>
-        <w:t xml:space="preserve">Tabuľka S5. </w:t>
+        <w:t xml:space="preserve">Tabuľka 6</w:t>
       </w:r>
+    </w:p>
+    <w:p>
+      <w:pPr>
+        <w:jc w:val="left"/>
+        <w:spacing w:after="80" w:line="276" w:lineRule="auto"/>
+      </w:pPr>
       <w:r>
         <w:rPr>
           <w:rFonts w:ascii="Times New Roman" w:hAnsi="Times New Roman" w:cs="Times New Roman"/>
@@ -6768,7 +6814,7 @@
           <w:sz w:val="20"/>
           <w:szCs w:val="20"/>
         </w:rPr>
-        <w:t xml:space="preserve">Predbežná expertná kontrola seed scenárov.</w:t>
+        <w:t xml:space="preserve">Predbežná expertná kontrola seed scenárov</w:t>
       </w:r>
     </w:p>
     <w:tbl>
@@ -7170,7 +7216,7 @@
                 <w:sz w:val="20"/>
                 <w:szCs w:val="20"/>
               </w:rPr>
-              <w:t xml:space="preserve">2.667</w:t>
+              <w:t xml:space="preserve">2.67</w:t>
             </w:r>
           </w:p>
         </w:tc>
@@ -7397,7 +7443,7 @@
                 <w:sz w:val="20"/>
                 <w:szCs w:val="20"/>
               </w:rPr>
-              <w:t xml:space="preserve">2.667</w:t>
+              <w:t xml:space="preserve">2.67</w:t>
             </w:r>
           </w:p>
         </w:tc>
@@ -7624,7 +7670,7 @@
                 <w:sz w:val="20"/>
                 <w:szCs w:val="20"/>
               </w:rPr>
-              <w:t xml:space="preserve">2.833</w:t>
+              <w:t xml:space="preserve">2.83</w:t>
             </w:r>
           </w:p>
         </w:tc>
@@ -7851,7 +7897,7 @@
                 <w:sz w:val="20"/>
                 <w:szCs w:val="20"/>
               </w:rPr>
-              <w:t xml:space="preserve">2.667</w:t>
+              <w:t xml:space="preserve">2.67</w:t>
             </w:r>
           </w:p>
         </w:tc>
@@ -8078,7 +8124,7 @@
                 <w:sz w:val="20"/>
                 <w:szCs w:val="20"/>
               </w:rPr>
-              <w:t xml:space="preserve">2.667</w:t>
+              <w:t xml:space="preserve">2.67</w:t>
             </w:r>
           </w:p>
         </w:tc>
@@ -8305,7 +8351,7 @@
                 <w:sz w:val="20"/>
                 <w:szCs w:val="20"/>
               </w:rPr>
-              <w:t xml:space="preserve">2.667</w:t>
+              <w:t xml:space="preserve">2.67</w:t>
             </w:r>
           </w:p>
         </w:tc>
@@ -8986,7 +9032,7 @@
                 <w:sz w:val="20"/>
                 <w:szCs w:val="20"/>
               </w:rPr>
-              <w:t xml:space="preserve">2.833</w:t>
+              <w:t xml:space="preserve">2.83</w:t>
             </w:r>
           </w:p>
         </w:tc>
@@ -9213,7 +9259,7 @@
                 <w:sz w:val="20"/>
                 <w:szCs w:val="20"/>
               </w:rPr>
-              <w:t xml:space="preserve">2.833</w:t>
+              <w:t xml:space="preserve">2.83</w:t>
             </w:r>
           </w:p>
         </w:tc>

</xml_diff>